<commit_message>
improved implementation of bias (IE) terms and their training (IE plasticity)
Co-authored-by: Copilot <copilot@github.com>
</commit_message>
<xml_diff>
--- a/Figure outline.docx
+++ b/Figure outline.docx
@@ -450,14 +450,9 @@
       <w:r>
         <w:t>S</w:t>
       </w:r>
-      <w:proofErr w:type="gramStart"/>
-      <w:r>
-        <w:t>7:</w:t>
-      </w:r>
-      <w:r>
-        <w:t>??</w:t>
-      </w:r>
-      <w:proofErr w:type="gramEnd"/>
+      <w:r>
+        <w:t>7: ??</w:t>
+      </w:r>
     </w:p>
     <w:sectPr>
       <w:pgSz w:w="11906" w:h="16838"/>
@@ -2121,6 +2116,7 @@
   <w:style w:type="character" w:default="1" w:styleId="DefaultParagraphFont">
     <w:name w:val="Default Paragraph Font"/>
     <w:uiPriority w:val="1"/>
+    <w:semiHidden/>
     <w:unhideWhenUsed/>
   </w:style>
   <w:style w:type="table" w:default="1" w:styleId="TableNormal">

</xml_diff>